<commit_message>
Update homework 1 docx with screenshots
</commit_message>
<xml_diff>
--- a/homework_1/homework_1_zakaria_zerhouni.docx
+++ b/homework_1/homework_1_zakaria_zerhouni.docx
@@ -214,7 +214,7 @@
     </w:p>
     <w:p>
       <w:pPr>
-        <w:pStyle w:val="BlockQuotation"/>
+        <w:pStyle w:val="BlockQuotationuser"/>
         <w:rPr/>
       </w:pPr>
       <w:r>
@@ -224,7 +224,7 @@
     </w:p>
     <w:p>
       <w:pPr>
-        <w:pStyle w:val="BlockQuotation"/>
+        <w:pStyle w:val="BlockQuotationuser"/>
         <w:rPr/>
       </w:pPr>
       <w:r>
@@ -234,7 +234,7 @@
     </w:p>
     <w:p>
       <w:pPr>
-        <w:pStyle w:val="BlockQuotation"/>
+        <w:pStyle w:val="BlockQuotationuser"/>
         <w:rPr/>
       </w:pPr>
       <w:r>
@@ -244,12 +244,889 @@
     </w:p>
     <w:p>
       <w:pPr>
-        <w:pStyle w:val="BlockQuotation"/>
+        <w:pStyle w:val="BlockQuotationuser"/>
         <w:rPr/>
       </w:pPr>
       <w:r>
         <w:rPr/>
         <w:t>[1] 9.617692</w:t>
+      </w:r>
+    </w:p>
+    <w:p>
+      <w:pPr>
+        <w:pStyle w:val="BodyText"/>
+        <w:spacing w:before="0" w:after="140"/>
+        <w:rPr/>
+      </w:pPr>
+      <w:r>
+        <w:rPr/>
+      </w:r>
+    </w:p>
+    <w:p>
+      <w:pPr>
+        <w:pStyle w:val="BodyText"/>
+        <w:spacing w:before="0" w:after="140"/>
+        <w:rPr/>
+      </w:pPr>
+      <w:r>
+        <w:rPr/>
+      </w:r>
+    </w:p>
+    <w:p>
+      <w:pPr>
+        <w:pStyle w:val="BodyText"/>
+        <w:spacing w:before="0" w:after="140"/>
+        <w:rPr/>
+      </w:pPr>
+      <w:r>
+        <w:rPr/>
+      </w:r>
+    </w:p>
+    <w:p>
+      <w:pPr>
+        <w:pStyle w:val="BodyText"/>
+        <w:spacing w:before="0" w:after="140"/>
+        <w:rPr/>
+      </w:pPr>
+      <w:r>
+        <w:rPr/>
+      </w:r>
+    </w:p>
+    <w:p>
+      <w:pPr>
+        <w:pStyle w:val="BodyText"/>
+        <w:spacing w:before="0" w:after="140"/>
+        <w:rPr/>
+      </w:pPr>
+      <w:r>
+        <w:rPr/>
+      </w:r>
+    </w:p>
+    <w:p>
+      <w:pPr>
+        <w:pStyle w:val="BodyText"/>
+        <w:spacing w:before="0" w:after="140"/>
+        <w:rPr/>
+      </w:pPr>
+      <w:r>
+        <w:rPr/>
+      </w:r>
+    </w:p>
+    <w:p>
+      <w:pPr>
+        <w:pStyle w:val="BodyText"/>
+        <w:spacing w:before="0" w:after="140"/>
+        <w:rPr/>
+      </w:pPr>
+      <w:r>
+        <w:rPr/>
+      </w:r>
+    </w:p>
+    <w:p>
+      <w:pPr>
+        <w:pStyle w:val="BodyText"/>
+        <w:spacing w:before="0" w:after="140"/>
+        <w:rPr/>
+      </w:pPr>
+      <w:r>
+        <w:rPr/>
+      </w:r>
+    </w:p>
+    <w:p>
+      <w:pPr>
+        <w:pStyle w:val="BodyText"/>
+        <w:spacing w:before="0" w:after="140"/>
+        <w:rPr/>
+      </w:pPr>
+      <w:r>
+        <w:rPr/>
+      </w:r>
+    </w:p>
+    <w:p>
+      <w:pPr>
+        <w:pStyle w:val="BodyText"/>
+        <w:spacing w:before="0" w:after="140"/>
+        <w:rPr/>
+      </w:pPr>
+      <w:r>
+        <w:rPr/>
+      </w:r>
+    </w:p>
+    <w:p>
+      <w:pPr>
+        <w:pStyle w:val="BodyText"/>
+        <w:spacing w:before="0" w:after="140"/>
+        <w:rPr/>
+      </w:pPr>
+      <w:r>
+        <w:rPr/>
+      </w:r>
+    </w:p>
+    <w:p>
+      <w:pPr>
+        <w:pStyle w:val="BodyText"/>
+        <w:spacing w:before="0" w:after="140"/>
+        <w:rPr/>
+      </w:pPr>
+      <w:r>
+        <w:rPr/>
+      </w:r>
+      <w:r>
+        <w:br w:type="page"/>
+      </w:r>
+    </w:p>
+    <w:p>
+      <w:pPr>
+        <w:pStyle w:val="BodyText"/>
+        <w:spacing w:before="0" w:after="140"/>
+        <w:rPr/>
+      </w:pPr>
+      <w:r>
+        <w:rPr/>
+      </w:r>
+    </w:p>
+    <w:p>
+      <w:pPr>
+        <w:pStyle w:val="BodyText"/>
+        <w:spacing w:before="0" w:after="140"/>
+        <w:rPr/>
+      </w:pPr>
+      <w:r>
+        <w:rPr/>
+      </w:r>
+    </w:p>
+    <w:p>
+      <w:pPr>
+        <w:pStyle w:val="BodyText"/>
+        <w:spacing w:before="0" w:after="140"/>
+        <w:rPr/>
+      </w:pPr>
+      <w:r>
+        <w:rPr/>
+        <w:drawing>
+          <wp:anchor distT="0" distB="0" distL="0" distR="0" simplePos="0" relativeHeight="2" behindDoc="0" locked="0" layoutInCell="0" allowOverlap="1">
+            <wp:simplePos x="0" y="0"/>
+            <wp:positionH relativeFrom="column">
+              <wp:align>center</wp:align>
+            </wp:positionH>
+            <wp:positionV relativeFrom="paragraph">
+              <wp:posOffset>635</wp:posOffset>
+            </wp:positionV>
+            <wp:extent cx="6332220" cy="7139940"/>
+            <wp:effectExtent l="0" t="0" r="0" b="0"/>
+            <wp:wrapSquare wrapText="largest"/>
+            <wp:docPr id="1" name="Image1"/>
+            <wp:cNvGraphicFramePr>
+              <a:graphicFrameLocks xmlns:a="http://schemas.openxmlformats.org/drawingml/2006/main" noChangeAspect="1"/>
+            </wp:cNvGraphicFramePr>
+            <a:graphic xmlns:a="http://schemas.openxmlformats.org/drawingml/2006/main">
+              <a:graphicData uri="http://schemas.openxmlformats.org/drawingml/2006/picture">
+                <pic:pic xmlns:pic="http://schemas.openxmlformats.org/drawingml/2006/picture">
+                  <pic:nvPicPr>
+                    <pic:cNvPr id="1" name="Image1"/>
+                    <pic:cNvPicPr>
+                      <a:picLocks noChangeAspect="1" noChangeArrowheads="1"/>
+                    </pic:cNvPicPr>
+                  </pic:nvPicPr>
+                  <pic:blipFill>
+                    <a:blip r:embed="rId2"/>
+                    <a:stretch>
+                      <a:fillRect/>
+                    </a:stretch>
+                  </pic:blipFill>
+                  <pic:spPr bwMode="auto">
+                    <a:xfrm>
+                      <a:off x="0" y="0"/>
+                      <a:ext cx="6332220" cy="7139940"/>
+                    </a:xfrm>
+                    <a:prstGeom prst="rect">
+                      <a:avLst/>
+                    </a:prstGeom>
+                    <a:noFill/>
+                  </pic:spPr>
+                </pic:pic>
+              </a:graphicData>
+            </a:graphic>
+          </wp:anchor>
+        </w:drawing>
+      </w:r>
+    </w:p>
+    <w:p>
+      <w:pPr>
+        <w:pStyle w:val="BodyText"/>
+        <w:spacing w:before="0" w:after="140"/>
+        <w:rPr/>
+      </w:pPr>
+      <w:r>
+        <w:rPr/>
+      </w:r>
+    </w:p>
+    <w:p>
+      <w:pPr>
+        <w:pStyle w:val="BodyText"/>
+        <w:spacing w:before="0" w:after="140"/>
+        <w:rPr/>
+      </w:pPr>
+      <w:r>
+        <w:rPr/>
+      </w:r>
+    </w:p>
+    <w:p>
+      <w:pPr>
+        <w:pStyle w:val="BodyText"/>
+        <w:spacing w:before="0" w:after="140"/>
+        <w:rPr/>
+      </w:pPr>
+      <w:r>
+        <w:rPr/>
+      </w:r>
+    </w:p>
+    <w:p>
+      <w:pPr>
+        <w:pStyle w:val="BodyText"/>
+        <w:spacing w:before="0" w:after="140"/>
+        <w:rPr/>
+      </w:pPr>
+      <w:r>
+        <w:rPr/>
+      </w:r>
+    </w:p>
+    <w:p>
+      <w:pPr>
+        <w:pStyle w:val="BodyText"/>
+        <w:spacing w:before="0" w:after="140"/>
+        <w:rPr/>
+      </w:pPr>
+      <w:r>
+        <w:rPr/>
+      </w:r>
+    </w:p>
+    <w:p>
+      <w:pPr>
+        <w:pStyle w:val="BodyText"/>
+        <w:spacing w:before="0" w:after="140"/>
+        <w:rPr/>
+      </w:pPr>
+      <w:r>
+        <w:rPr/>
+        <w:drawing>
+          <wp:anchor distT="0" distB="0" distL="0" distR="0" simplePos="0" relativeHeight="3" behindDoc="0" locked="0" layoutInCell="0" allowOverlap="1">
+            <wp:simplePos x="0" y="0"/>
+            <wp:positionH relativeFrom="column">
+              <wp:align>center</wp:align>
+            </wp:positionH>
+            <wp:positionV relativeFrom="paragraph">
+              <wp:posOffset>635</wp:posOffset>
+            </wp:positionV>
+            <wp:extent cx="6332220" cy="6375400"/>
+            <wp:effectExtent l="0" t="0" r="0" b="0"/>
+            <wp:wrapSquare wrapText="largest"/>
+            <wp:docPr id="2" name="Image2"/>
+            <wp:cNvGraphicFramePr>
+              <a:graphicFrameLocks xmlns:a="http://schemas.openxmlformats.org/drawingml/2006/main" noChangeAspect="1"/>
+            </wp:cNvGraphicFramePr>
+            <a:graphic xmlns:a="http://schemas.openxmlformats.org/drawingml/2006/main">
+              <a:graphicData uri="http://schemas.openxmlformats.org/drawingml/2006/picture">
+                <pic:pic xmlns:pic="http://schemas.openxmlformats.org/drawingml/2006/picture">
+                  <pic:nvPicPr>
+                    <pic:cNvPr id="2" name="Image2"/>
+                    <pic:cNvPicPr>
+                      <a:picLocks noChangeAspect="1" noChangeArrowheads="1"/>
+                    </pic:cNvPicPr>
+                  </pic:nvPicPr>
+                  <pic:blipFill>
+                    <a:blip r:embed="rId3"/>
+                    <a:stretch>
+                      <a:fillRect/>
+                    </a:stretch>
+                  </pic:blipFill>
+                  <pic:spPr bwMode="auto">
+                    <a:xfrm>
+                      <a:off x="0" y="0"/>
+                      <a:ext cx="6332220" cy="6375400"/>
+                    </a:xfrm>
+                    <a:prstGeom prst="rect">
+                      <a:avLst/>
+                    </a:prstGeom>
+                    <a:noFill/>
+                  </pic:spPr>
+                </pic:pic>
+              </a:graphicData>
+            </a:graphic>
+          </wp:anchor>
+        </w:drawing>
+      </w:r>
+    </w:p>
+    <w:p>
+      <w:pPr>
+        <w:pStyle w:val="BodyText"/>
+        <w:spacing w:before="0" w:after="140"/>
+        <w:rPr/>
+      </w:pPr>
+      <w:r>
+        <w:rPr/>
+      </w:r>
+    </w:p>
+    <w:p>
+      <w:pPr>
+        <w:pStyle w:val="BodyText"/>
+        <w:spacing w:before="0" w:after="140"/>
+        <w:rPr/>
+      </w:pPr>
+      <w:r>
+        <w:rPr/>
+      </w:r>
+    </w:p>
+    <w:p>
+      <w:pPr>
+        <w:pStyle w:val="BodyText"/>
+        <w:spacing w:before="0" w:after="140"/>
+        <w:rPr/>
+      </w:pPr>
+      <w:r>
+        <w:rPr/>
+      </w:r>
+    </w:p>
+    <w:p>
+      <w:pPr>
+        <w:pStyle w:val="BodyText"/>
+        <w:spacing w:before="0" w:after="140"/>
+        <w:rPr/>
+      </w:pPr>
+      <w:r>
+        <w:rPr/>
+      </w:r>
+    </w:p>
+    <w:p>
+      <w:pPr>
+        <w:pStyle w:val="BodyText"/>
+        <w:spacing w:before="0" w:after="140"/>
+        <w:rPr/>
+      </w:pPr>
+      <w:r>
+        <w:rPr/>
+      </w:r>
+    </w:p>
+    <w:p>
+      <w:pPr>
+        <w:pStyle w:val="BodyText"/>
+        <w:spacing w:before="0" w:after="140"/>
+        <w:rPr/>
+      </w:pPr>
+      <w:r>
+        <w:rPr/>
+      </w:r>
+    </w:p>
+    <w:p>
+      <w:pPr>
+        <w:pStyle w:val="BodyText"/>
+        <w:spacing w:before="0" w:after="140"/>
+        <w:rPr/>
+      </w:pPr>
+      <w:r>
+        <w:rPr/>
+      </w:r>
+    </w:p>
+    <w:p>
+      <w:pPr>
+        <w:pStyle w:val="BodyText"/>
+        <w:spacing w:before="0" w:after="140"/>
+        <w:rPr/>
+      </w:pPr>
+      <w:r>
+        <w:rPr/>
+      </w:r>
+    </w:p>
+    <w:p>
+      <w:pPr>
+        <w:pStyle w:val="BodyText"/>
+        <w:spacing w:before="0" w:after="140"/>
+        <w:rPr/>
+      </w:pPr>
+      <w:r>
+        <w:rPr/>
+      </w:r>
+    </w:p>
+    <w:p>
+      <w:pPr>
+        <w:pStyle w:val="BodyText"/>
+        <w:spacing w:before="0" w:after="140"/>
+        <w:rPr/>
+      </w:pPr>
+      <w:r>
+        <w:rPr/>
+      </w:r>
+    </w:p>
+    <w:p>
+      <w:pPr>
+        <w:pStyle w:val="BodyText"/>
+        <w:spacing w:before="0" w:after="140"/>
+        <w:rPr/>
+      </w:pPr>
+      <w:r>
+        <w:rPr/>
+        <w:drawing>
+          <wp:anchor distT="0" distB="0" distL="0" distR="0" simplePos="0" relativeHeight="4" behindDoc="0" locked="0" layoutInCell="0" allowOverlap="1">
+            <wp:simplePos x="0" y="0"/>
+            <wp:positionH relativeFrom="column">
+              <wp:align>center</wp:align>
+            </wp:positionH>
+            <wp:positionV relativeFrom="paragraph">
+              <wp:posOffset>635</wp:posOffset>
+            </wp:positionV>
+            <wp:extent cx="6332220" cy="3440430"/>
+            <wp:effectExtent l="0" t="0" r="0" b="0"/>
+            <wp:wrapSquare wrapText="largest"/>
+            <wp:docPr id="3" name="Image3"/>
+            <wp:cNvGraphicFramePr>
+              <a:graphicFrameLocks xmlns:a="http://schemas.openxmlformats.org/drawingml/2006/main" noChangeAspect="1"/>
+            </wp:cNvGraphicFramePr>
+            <a:graphic xmlns:a="http://schemas.openxmlformats.org/drawingml/2006/main">
+              <a:graphicData uri="http://schemas.openxmlformats.org/drawingml/2006/picture">
+                <pic:pic xmlns:pic="http://schemas.openxmlformats.org/drawingml/2006/picture">
+                  <pic:nvPicPr>
+                    <pic:cNvPr id="3" name="Image3"/>
+                    <pic:cNvPicPr>
+                      <a:picLocks noChangeAspect="1" noChangeArrowheads="1"/>
+                    </pic:cNvPicPr>
+                  </pic:nvPicPr>
+                  <pic:blipFill>
+                    <a:blip r:embed="rId4"/>
+                    <a:stretch>
+                      <a:fillRect/>
+                    </a:stretch>
+                  </pic:blipFill>
+                  <pic:spPr bwMode="auto">
+                    <a:xfrm>
+                      <a:off x="0" y="0"/>
+                      <a:ext cx="6332220" cy="3440430"/>
+                    </a:xfrm>
+                    <a:prstGeom prst="rect">
+                      <a:avLst/>
+                    </a:prstGeom>
+                    <a:noFill/>
+                  </pic:spPr>
+                </pic:pic>
+              </a:graphicData>
+            </a:graphic>
+          </wp:anchor>
+        </w:drawing>
+      </w:r>
+    </w:p>
+    <w:p>
+      <w:pPr>
+        <w:pStyle w:val="BodyText"/>
+        <w:spacing w:before="0" w:after="140"/>
+        <w:rPr/>
+      </w:pPr>
+      <w:r>
+        <w:rPr/>
+      </w:r>
+    </w:p>
+    <w:p>
+      <w:pPr>
+        <w:pStyle w:val="BodyText"/>
+        <w:spacing w:before="0" w:after="140"/>
+        <w:rPr/>
+      </w:pPr>
+      <w:r>
+        <w:rPr/>
+      </w:r>
+    </w:p>
+    <w:p>
+      <w:pPr>
+        <w:pStyle w:val="BodyText"/>
+        <w:spacing w:before="0" w:after="140"/>
+        <w:rPr/>
+      </w:pPr>
+      <w:r>
+        <w:rPr/>
+      </w:r>
+    </w:p>
+    <w:p>
+      <w:pPr>
+        <w:pStyle w:val="BodyText"/>
+        <w:spacing w:before="0" w:after="140"/>
+        <w:rPr/>
+      </w:pPr>
+      <w:r>
+        <w:rPr/>
+      </w:r>
+    </w:p>
+    <w:p>
+      <w:pPr>
+        <w:pStyle w:val="BodyText"/>
+        <w:spacing w:before="0" w:after="140"/>
+        <w:rPr/>
+      </w:pPr>
+      <w:r>
+        <w:rPr/>
+      </w:r>
+    </w:p>
+    <w:p>
+      <w:pPr>
+        <w:pStyle w:val="BodyText"/>
+        <w:spacing w:before="0" w:after="140"/>
+        <w:rPr/>
+      </w:pPr>
+      <w:r>
+        <w:rPr/>
+      </w:r>
+    </w:p>
+    <w:p>
+      <w:pPr>
+        <w:pStyle w:val="BodyText"/>
+        <w:spacing w:before="0" w:after="140"/>
+        <w:rPr/>
+      </w:pPr>
+      <w:r>
+        <w:rPr/>
+      </w:r>
+    </w:p>
+    <w:p>
+      <w:pPr>
+        <w:pStyle w:val="BodyText"/>
+        <w:spacing w:before="0" w:after="140"/>
+        <w:rPr/>
+      </w:pPr>
+      <w:r>
+        <w:rPr/>
+      </w:r>
+    </w:p>
+    <w:p>
+      <w:pPr>
+        <w:pStyle w:val="BodyText"/>
+        <w:spacing w:before="0" w:after="140"/>
+        <w:rPr/>
+      </w:pPr>
+      <w:r>
+        <w:rPr/>
+      </w:r>
+    </w:p>
+    <w:p>
+      <w:pPr>
+        <w:pStyle w:val="BodyText"/>
+        <w:spacing w:before="0" w:after="140"/>
+        <w:rPr/>
+      </w:pPr>
+      <w:r>
+        <w:rPr/>
+      </w:r>
+      <w:r>
+        <w:br w:type="page"/>
+      </w:r>
+    </w:p>
+    <w:p>
+      <w:pPr>
+        <w:pStyle w:val="BodyText"/>
+        <w:spacing w:before="0" w:after="140"/>
+        <w:rPr/>
+      </w:pPr>
+      <w:r>
+        <w:rPr/>
+      </w:r>
+    </w:p>
+    <w:p>
+      <w:pPr>
+        <w:pStyle w:val="BodyText"/>
+        <w:spacing w:before="0" w:after="140"/>
+        <w:rPr/>
+      </w:pPr>
+      <w:r>
+        <w:rPr/>
+      </w:r>
+    </w:p>
+    <w:p>
+      <w:pPr>
+        <w:pStyle w:val="BodyText"/>
+        <w:spacing w:before="0" w:after="140"/>
+        <w:rPr/>
+      </w:pPr>
+      <w:r>
+        <w:rPr/>
+      </w:r>
+    </w:p>
+    <w:p>
+      <w:pPr>
+        <w:pStyle w:val="BodyText"/>
+        <w:spacing w:before="0" w:after="140"/>
+        <w:rPr/>
+      </w:pPr>
+      <w:r>
+        <w:rPr/>
+      </w:r>
+    </w:p>
+    <w:p>
+      <w:pPr>
+        <w:pStyle w:val="BodyText"/>
+        <w:spacing w:before="0" w:after="140"/>
+        <w:rPr/>
+      </w:pPr>
+      <w:r>
+        <w:rPr/>
+      </w:r>
+    </w:p>
+    <w:p>
+      <w:pPr>
+        <w:pStyle w:val="BodyText"/>
+        <w:spacing w:before="0" w:after="140"/>
+        <w:rPr/>
+      </w:pPr>
+      <w:r>
+        <w:rPr/>
+      </w:r>
+    </w:p>
+    <w:p>
+      <w:pPr>
+        <w:pStyle w:val="BodyText"/>
+        <w:spacing w:before="0" w:after="140"/>
+        <w:rPr/>
+      </w:pPr>
+      <w:r>
+        <w:rPr/>
+      </w:r>
+    </w:p>
+    <w:p>
+      <w:pPr>
+        <w:pStyle w:val="BodyText"/>
+        <w:spacing w:before="0" w:after="140"/>
+        <w:rPr/>
+      </w:pPr>
+      <w:r>
+        <w:rPr/>
+      </w:r>
+    </w:p>
+    <w:p>
+      <w:pPr>
+        <w:pStyle w:val="BodyText"/>
+        <w:spacing w:before="0" w:after="140"/>
+        <w:rPr/>
+      </w:pPr>
+      <w:r>
+        <w:rPr/>
+      </w:r>
+    </w:p>
+    <w:p>
+      <w:pPr>
+        <w:pStyle w:val="BodyText"/>
+        <w:spacing w:before="0" w:after="140"/>
+        <w:rPr/>
+      </w:pPr>
+      <w:r>
+        <w:rPr/>
+      </w:r>
+    </w:p>
+    <w:p>
+      <w:pPr>
+        <w:pStyle w:val="BodyText"/>
+        <w:spacing w:before="0" w:after="140"/>
+        <w:rPr/>
+      </w:pPr>
+      <w:r>
+        <w:rPr/>
+      </w:r>
+    </w:p>
+    <w:p>
+      <w:pPr>
+        <w:pStyle w:val="BodyText"/>
+        <w:spacing w:before="0" w:after="140"/>
+        <w:rPr/>
+      </w:pPr>
+      <w:r>
+        <w:rPr/>
+      </w:r>
+    </w:p>
+    <w:p>
+      <w:pPr>
+        <w:pStyle w:val="BodyText"/>
+        <w:spacing w:before="0" w:after="140"/>
+        <w:rPr/>
+      </w:pPr>
+      <w:r>
+        <w:rPr/>
+      </w:r>
+    </w:p>
+    <w:p>
+      <w:pPr>
+        <w:pStyle w:val="BodyText"/>
+        <w:spacing w:before="0" w:after="140"/>
+        <w:rPr/>
+      </w:pPr>
+      <w:r>
+        <w:rPr/>
+      </w:r>
+    </w:p>
+    <w:p>
+      <w:pPr>
+        <w:pStyle w:val="BodyText"/>
+        <w:spacing w:before="0" w:after="140"/>
+        <w:rPr/>
+      </w:pPr>
+      <w:r>
+        <w:rPr/>
+      </w:r>
+    </w:p>
+    <w:p>
+      <w:pPr>
+        <w:pStyle w:val="BodyText"/>
+        <w:spacing w:before="0" w:after="140"/>
+        <w:rPr/>
+      </w:pPr>
+      <w:r>
+        <w:rPr/>
+      </w:r>
+    </w:p>
+    <w:p>
+      <w:pPr>
+        <w:pStyle w:val="BodyText"/>
+        <w:spacing w:before="0" w:after="140"/>
+        <w:rPr/>
+      </w:pPr>
+      <w:r>
+        <w:rPr/>
+      </w:r>
+    </w:p>
+    <w:p>
+      <w:pPr>
+        <w:pStyle w:val="BodyText"/>
+        <w:spacing w:before="0" w:after="140"/>
+        <w:rPr/>
+      </w:pPr>
+      <w:r>
+        <w:rPr/>
+      </w:r>
+    </w:p>
+    <w:p>
+      <w:pPr>
+        <w:pStyle w:val="BodyText"/>
+        <w:spacing w:before="0" w:after="140"/>
+        <w:rPr/>
+      </w:pPr>
+      <w:r>
+        <w:rPr/>
+      </w:r>
+    </w:p>
+    <w:p>
+      <w:pPr>
+        <w:pStyle w:val="BodyText"/>
+        <w:spacing w:before="0" w:after="140"/>
+        <w:rPr/>
+      </w:pPr>
+      <w:r>
+        <w:rPr/>
+      </w:r>
+    </w:p>
+    <w:p>
+      <w:pPr>
+        <w:pStyle w:val="BodyText"/>
+        <w:spacing w:before="0" w:after="140"/>
+        <w:rPr/>
+      </w:pPr>
+      <w:r>
+        <w:rPr/>
+      </w:r>
+    </w:p>
+    <w:p>
+      <w:pPr>
+        <w:pStyle w:val="BodyText"/>
+        <w:spacing w:before="0" w:after="140"/>
+        <w:rPr/>
+      </w:pPr>
+      <w:r>
+        <w:rPr/>
+      </w:r>
+    </w:p>
+    <w:p>
+      <w:pPr>
+        <w:pStyle w:val="BodyText"/>
+        <w:spacing w:before="0" w:after="140"/>
+        <w:rPr/>
+      </w:pPr>
+      <w:r>
+        <w:rPr/>
+      </w:r>
+    </w:p>
+    <w:p>
+      <w:pPr>
+        <w:pStyle w:val="BodyText"/>
+        <w:spacing w:before="0" w:after="140"/>
+        <w:rPr/>
+      </w:pPr>
+      <w:r>
+        <w:rPr/>
+      </w:r>
+    </w:p>
+    <w:p>
+      <w:pPr>
+        <w:pStyle w:val="BodyText"/>
+        <w:spacing w:before="0" w:after="140"/>
+        <w:rPr/>
+      </w:pPr>
+      <w:r>
+        <w:rPr/>
+      </w:r>
+    </w:p>
+    <w:p>
+      <w:pPr>
+        <w:pStyle w:val="BodyText"/>
+        <w:spacing w:before="0" w:after="140"/>
+        <w:rPr/>
+      </w:pPr>
+      <w:r>
+        <w:rPr/>
+      </w:r>
+    </w:p>
+    <w:p>
+      <w:pPr>
+        <w:pStyle w:val="BodyText"/>
+        <w:spacing w:before="0" w:after="140"/>
+        <w:rPr/>
+      </w:pPr>
+      <w:r>
+        <w:rPr/>
+      </w:r>
+    </w:p>
+    <w:p>
+      <w:pPr>
+        <w:pStyle w:val="BodyText"/>
+        <w:spacing w:before="0" w:after="140"/>
+        <w:rPr/>
+      </w:pPr>
+      <w:r>
+        <w:rPr/>
+      </w:r>
+    </w:p>
+    <w:p>
+      <w:pPr>
+        <w:pStyle w:val="BodyText"/>
+        <w:spacing w:before="0" w:after="140"/>
+        <w:rPr/>
+      </w:pPr>
+      <w:r>
+        <w:rPr/>
+      </w:r>
+    </w:p>
+    <w:p>
+      <w:pPr>
+        <w:pStyle w:val="BodyText"/>
+        <w:spacing w:before="0" w:after="140"/>
+        <w:rPr/>
+      </w:pPr>
+      <w:r>
+        <w:rPr/>
+      </w:r>
+      <w:r>
+        <w:br w:type="page"/>
+      </w:r>
+    </w:p>
+    <w:p>
+      <w:pPr>
+        <w:pStyle w:val="BodyText"/>
+        <w:spacing w:before="0" w:after="140"/>
+        <w:rPr/>
+      </w:pPr>
+      <w:r>
+        <w:rPr/>
       </w:r>
     </w:p>
     <w:p>
@@ -370,8 +1247,8 @@
       <w:rFonts w:cs="Arial Unicode MS"/>
     </w:rPr>
   </w:style>
-  <w:style w:type="paragraph" w:styleId="BlockQuotation">
-    <w:name w:val="Block Quotation"/>
+  <w:style w:type="paragraph" w:styleId="BlockQuotationuser">
+    <w:name w:val="Block Quotation (user)"/>
     <w:basedOn w:val="Normal"/>
     <w:qFormat/>
     <w:pPr>

</xml_diff>